<commit_message>
Brief: budget is for the whole project; drop 'what it should cover' everywhere
Co-Authored-By: Claude Opus 5.5 <noreply@anthropic.com>
Claude-Session: https://claude.ai/code/session_01B97nPoqq1BTtbztXedy2HT
</commit_message>
<xml_diff>
--- a/downloads/1o1expo-stand-brief-template.docx
+++ b/downloads/1o1expo-stand-brief-template.docx
@@ -1704,68 +1704,7 @@
                 <w:sz w:val="19"/>
                 <w:szCs w:val="19"/>
               </w:rPr>
-              <w:t xml:space="preserve">Budget range for the whole stand</w:t>
-            </w:r>
-          </w:p>
-        </w:tc>
-        <w:tc>
-          <w:tcPr>
-            <w:tcW w:type="dxa" w:w="6038"/>
-            <w:tcBorders>
-              <w:top w:val="none" w:color="FFFFFF" w:sz="0"/>
-              <w:left w:val="none" w:color="FFFFFF" w:sz="0"/>
-              <w:bottom w:val="single" w:color="D8D1C5" w:sz="4"/>
-              <w:right w:val="none" w:color="FFFFFF" w:sz="0"/>
-            </w:tcBorders>
-            <w:tcMar>
-              <w:top w:type="dxa" w:w="90"/>
-              <w:left w:type="dxa" w:w="160"/>
-              <w:bottom w:type="dxa" w:w="90"/>
-              <w:right w:type="dxa" w:w="120"/>
-            </w:tcMar>
-          </w:tcPr>
-          <w:p>
-            <w:r>
-              <w:rPr>
-                <w:rFonts w:ascii="Arial" w:cs="Arial" w:eastAsia="Arial" w:hAnsi="Arial"/>
-                <w:sz w:val="20"/>
-                <w:szCs w:val="20"/>
-              </w:rPr>
-              <w:t xml:space="preserve"/>
-            </w:r>
-          </w:p>
-        </w:tc>
-      </w:tr>
-      <w:tr>
-        <w:trPr>
-          <w:trHeight w:val="520" w:hRule="atLeast"/>
-        </w:trPr>
-        <w:tc>
-          <w:tcPr>
-            <w:tcW w:type="dxa" w:w="3600"/>
-            <w:tcBorders>
-              <w:top w:val="none" w:color="FFFFFF" w:sz="0"/>
-              <w:left w:val="none" w:color="FFFFFF" w:sz="0"/>
-              <w:bottom w:val="single" w:color="D8D1C5" w:sz="4"/>
-              <w:right w:val="none" w:color="FFFFFF" w:sz="0"/>
-            </w:tcBorders>
-            <w:shd w:fill="F5F2EC" w:color="auto" w:val="clear"/>
-            <w:tcMar>
-              <w:top w:type="dxa" w:w="90"/>
-              <w:left w:type="dxa" w:w="120"/>
-              <w:bottom w:type="dxa" w:w="90"/>
-              <w:right w:type="dxa" w:w="120"/>
-            </w:tcMar>
-          </w:tcPr>
-          <w:p>
-            <w:r>
-              <w:rPr>
-                <w:rFonts w:ascii="Arial" w:cs="Arial" w:eastAsia="Arial" w:hAnsi="Arial"/>
-                <w:color w:val="1C1A17"/>
-                <w:sz w:val="19"/>
-                <w:szCs w:val="19"/>
-              </w:rPr>
-              <w:t xml:space="preserve">What it should cover</w:t>
+              <w:t xml:space="preserve">Budget range for the whole project</w:t>
             </w:r>
           </w:p>
         </w:tc>

</xml_diff>

<commit_message>
Brief template: one open field for must-haves, attachment checklist for brand files
Co-Authored-By: Claude Opus 5.5 <noreply@anthropic.com>
Claude-Session: https://claude.ai/code/session_01B97nPoqq1BTtbztXedy2HT
</commit_message>
<xml_diff>
--- a/downloads/1o1expo-stand-brief-template.docx
+++ b/downloads/1o1expo-stand-brief-template.docx
@@ -1119,7 +1119,7 @@
       </w:tblGrid>
       <w:tr>
         <w:trPr>
-          <w:trHeight w:val="520" w:hRule="atLeast"/>
+          <w:trHeight w:val="2600" w:hRule="atLeast"/>
         </w:trPr>
         <w:tc>
           <w:tcPr>
@@ -1146,190 +1146,21 @@
                 <w:sz w:val="19"/>
                 <w:szCs w:val="19"/>
               </w:rPr>
-              <w:t xml:space="preserve">Products to show (sizes, weights)</w:t>
-            </w:r>
-          </w:p>
-        </w:tc>
-        <w:tc>
-          <w:tcPr>
-            <w:tcW w:type="dxa" w:w="6038"/>
-            <w:tcBorders>
-              <w:top w:val="none" w:color="FFFFFF" w:sz="0"/>
-              <w:left w:val="none" w:color="FFFFFF" w:sz="0"/>
-              <w:bottom w:val="single" w:color="D8D1C5" w:sz="4"/>
-              <w:right w:val="none" w:color="FFFFFF" w:sz="0"/>
-            </w:tcBorders>
-            <w:tcMar>
-              <w:top w:type="dxa" w:w="90"/>
-              <w:left w:type="dxa" w:w="160"/>
-              <w:bottom w:type="dxa" w:w="90"/>
-              <w:right w:type="dxa" w:w="120"/>
-            </w:tcMar>
-          </w:tcPr>
-          <w:p>
-            <w:r>
-              <w:rPr>
-                <w:rFonts w:ascii="Arial" w:cs="Arial" w:eastAsia="Arial" w:hAnsi="Arial"/>
-                <w:sz w:val="20"/>
-                <w:szCs w:val="20"/>
-              </w:rPr>
-              <w:t xml:space="preserve"/>
-            </w:r>
-          </w:p>
-        </w:tc>
-      </w:tr>
-      <w:tr>
-        <w:trPr>
-          <w:trHeight w:val="520" w:hRule="atLeast"/>
-        </w:trPr>
-        <w:tc>
-          <w:tcPr>
-            <w:tcW w:type="dxa" w:w="3600"/>
-            <w:tcBorders>
-              <w:top w:val="none" w:color="FFFFFF" w:sz="0"/>
-              <w:left w:val="none" w:color="FFFFFF" w:sz="0"/>
-              <w:bottom w:val="single" w:color="D8D1C5" w:sz="4"/>
-              <w:right w:val="none" w:color="FFFFFF" w:sz="0"/>
-            </w:tcBorders>
-            <w:shd w:fill="F5F2EC" w:color="auto" w:val="clear"/>
-            <w:tcMar>
-              <w:top w:type="dxa" w:w="90"/>
-              <w:left w:type="dxa" w:w="120"/>
-              <w:bottom w:type="dxa" w:w="90"/>
-              <w:right w:type="dxa" w:w="120"/>
-            </w:tcMar>
-          </w:tcPr>
-          <w:p>
-            <w:r>
-              <w:rPr>
-                <w:rFonts w:ascii="Arial" w:cs="Arial" w:eastAsia="Arial" w:hAnsi="Arial"/>
-                <w:color w:val="1C1A17"/>
-                <w:sz w:val="19"/>
-                <w:szCs w:val="19"/>
-              </w:rPr>
-              <w:t xml:space="preserve">Screens, counters, shelves, display cases</w:t>
-            </w:r>
-          </w:p>
-        </w:tc>
-        <w:tc>
-          <w:tcPr>
-            <w:tcW w:type="dxa" w:w="6038"/>
-            <w:tcBorders>
-              <w:top w:val="none" w:color="FFFFFF" w:sz="0"/>
-              <w:left w:val="none" w:color="FFFFFF" w:sz="0"/>
-              <w:bottom w:val="single" w:color="D8D1C5" w:sz="4"/>
-              <w:right w:val="none" w:color="FFFFFF" w:sz="0"/>
-            </w:tcBorders>
-            <w:tcMar>
-              <w:top w:type="dxa" w:w="90"/>
-              <w:left w:type="dxa" w:w="160"/>
-              <w:bottom w:type="dxa" w:w="90"/>
-              <w:right w:type="dxa" w:w="120"/>
-            </w:tcMar>
-          </w:tcPr>
-          <w:p>
-            <w:r>
-              <w:rPr>
-                <w:rFonts w:ascii="Arial" w:cs="Arial" w:eastAsia="Arial" w:hAnsi="Arial"/>
-                <w:sz w:val="20"/>
-                <w:szCs w:val="20"/>
-              </w:rPr>
-              <w:t xml:space="preserve"/>
-            </w:r>
-          </w:p>
-        </w:tc>
-      </w:tr>
-      <w:tr>
-        <w:trPr>
-          <w:trHeight w:val="520" w:hRule="atLeast"/>
-        </w:trPr>
-        <w:tc>
-          <w:tcPr>
-            <w:tcW w:type="dxa" w:w="3600"/>
-            <w:tcBorders>
-              <w:top w:val="none" w:color="FFFFFF" w:sz="0"/>
-              <w:left w:val="none" w:color="FFFFFF" w:sz="0"/>
-              <w:bottom w:val="single" w:color="D8D1C5" w:sz="4"/>
-              <w:right w:val="none" w:color="FFFFFF" w:sz="0"/>
-            </w:tcBorders>
-            <w:shd w:fill="F5F2EC" w:color="auto" w:val="clear"/>
-            <w:tcMar>
-              <w:top w:type="dxa" w:w="90"/>
-              <w:left w:type="dxa" w:w="120"/>
-              <w:bottom w:type="dxa" w:w="90"/>
-              <w:right w:type="dxa" w:w="120"/>
-            </w:tcMar>
-          </w:tcPr>
-          <w:p>
-            <w:r>
-              <w:rPr>
-                <w:rFonts w:ascii="Arial" w:cs="Arial" w:eastAsia="Arial" w:hAnsi="Arial"/>
-                <w:color w:val="1C1A17"/>
-                <w:sz w:val="19"/>
-                <w:szCs w:val="19"/>
-              </w:rPr>
-              <w:t xml:space="preserve">Meeting area (open or closed, how many seats)</w:t>
-            </w:r>
-          </w:p>
-        </w:tc>
-        <w:tc>
-          <w:tcPr>
-            <w:tcW w:type="dxa" w:w="6038"/>
-            <w:tcBorders>
-              <w:top w:val="none" w:color="FFFFFF" w:sz="0"/>
-              <w:left w:val="none" w:color="FFFFFF" w:sz="0"/>
-              <w:bottom w:val="single" w:color="D8D1C5" w:sz="4"/>
-              <w:right w:val="none" w:color="FFFFFF" w:sz="0"/>
-            </w:tcBorders>
-            <w:tcMar>
-              <w:top w:type="dxa" w:w="90"/>
-              <w:left w:type="dxa" w:w="160"/>
-              <w:bottom w:type="dxa" w:w="90"/>
-              <w:right w:type="dxa" w:w="120"/>
-            </w:tcMar>
-          </w:tcPr>
-          <w:p>
-            <w:r>
-              <w:rPr>
-                <w:rFonts w:ascii="Arial" w:cs="Arial" w:eastAsia="Arial" w:hAnsi="Arial"/>
-                <w:sz w:val="20"/>
-                <w:szCs w:val="20"/>
-              </w:rPr>
-              <w:t xml:space="preserve"/>
-            </w:r>
-          </w:p>
-        </w:tc>
-      </w:tr>
-      <w:tr>
-        <w:trPr>
-          <w:trHeight w:val="520" w:hRule="atLeast"/>
-        </w:trPr>
-        <w:tc>
-          <w:tcPr>
-            <w:tcW w:type="dxa" w:w="3600"/>
-            <w:tcBorders>
-              <w:top w:val="none" w:color="FFFFFF" w:sz="0"/>
-              <w:left w:val="none" w:color="FFFFFF" w:sz="0"/>
-              <w:bottom w:val="single" w:color="D8D1C5" w:sz="4"/>
-              <w:right w:val="none" w:color="FFFFFF" w:sz="0"/>
-            </w:tcBorders>
-            <w:shd w:fill="F5F2EC" w:color="auto" w:val="clear"/>
-            <w:tcMar>
-              <w:top w:type="dxa" w:w="90"/>
-              <w:left w:type="dxa" w:w="120"/>
-              <w:bottom w:type="dxa" w:w="90"/>
-              <w:right w:type="dxa" w:w="120"/>
-            </w:tcMar>
-          </w:tcPr>
-          <w:p>
-            <w:r>
-              <w:rPr>
-                <w:rFonts w:ascii="Arial" w:cs="Arial" w:eastAsia="Arial" w:hAnsi="Arial"/>
-                <w:color w:val="1C1A17"/>
-                <w:sz w:val="19"/>
-                <w:szCs w:val="19"/>
-              </w:rPr>
-              <w:t xml:space="preserve">Storage room, kitchen, bar, other</w:t>
+              <w:t xml:space="preserve">What the stand must hold</w:t>
+            </w:r>
+          </w:p>
+          <w:p>
+            <w:pPr>
+              <w:spacing w:before="80"/>
+            </w:pPr>
+            <w:r>
+              <w:rPr>
+                <w:rFonts w:ascii="Arial" w:cs="Arial" w:eastAsia="Arial" w:hAnsi="Arial"/>
+                <w:color w:val="5B5650"/>
+                <w:sz w:val="16"/>
+                <w:szCs w:val="16"/>
+              </w:rPr>
+              <w:t xml:space="preserve">For example: products to show (with sizes and weights), screens, counters, shelves, a meeting area (open or closed, how many seats), a storage room, a kitchen or a bar.</w:t>
             </w:r>
           </w:p>
         </w:tc>
@@ -1379,6 +1210,121 @@
         </w:rPr>
         <w:t xml:space="preserve">4  YOUR BRAND</w:t>
       </w:r>
+    </w:p>
+    <w:p>
+      <w:pPr>
+        <w:spacing w:after="60"/>
+      </w:pPr>
+      <w:r>
+        <w:rPr>
+          <w:rFonts w:ascii="Arial" w:cs="Arial" w:eastAsia="Arial" w:hAnsi="Arial"/>
+          <w:color w:val="1C1A17"/>
+          <w:sz w:val="19"/>
+          <w:szCs w:val="19"/>
+        </w:rPr>
+        <w:t xml:space="preserve">Please attach to your email what you have:</w:t>
+      </w:r>
+    </w:p>
+    <w:p>
+      <w:pPr>
+        <w:spacing w:after="40"/>
+        <w:ind w:left="120"/>
+      </w:pPr>
+      <w:r>
+        <w:rPr>
+          <w:rFonts w:ascii="DejaVu Sans" w:cs="DejaVu Sans" w:eastAsia="DejaVu Sans" w:hAnsi="DejaVu Sans"/>
+          <w:color w:val="1C1A17"/>
+          <w:sz w:val="22"/>
+          <w:szCs w:val="22"/>
+        </w:rPr>
+        <w:t xml:space="preserve">☐</w:t>
+      </w:r>
+      <w:r>
+        <w:rPr>
+          <w:rFonts w:ascii="Arial" w:cs="Arial" w:eastAsia="Arial" w:hAnsi="Arial"/>
+          <w:color w:val="1C1A17"/>
+          <w:sz w:val="19"/>
+          <w:szCs w:val="19"/>
+        </w:rPr>
+        <w:t xml:space="preserve">   Logo as a vector file (AI, EPS, SVG or PDF)</w:t>
+      </w:r>
+    </w:p>
+    <w:p>
+      <w:pPr>
+        <w:spacing w:after="40"/>
+        <w:ind w:left="120"/>
+      </w:pPr>
+      <w:r>
+        <w:rPr>
+          <w:rFonts w:ascii="DejaVu Sans" w:cs="DejaVu Sans" w:eastAsia="DejaVu Sans" w:hAnsi="DejaVu Sans"/>
+          <w:color w:val="1C1A17"/>
+          <w:sz w:val="22"/>
+          <w:szCs w:val="22"/>
+        </w:rPr>
+        <w:t xml:space="preserve">☐</w:t>
+      </w:r>
+      <w:r>
+        <w:rPr>
+          <w:rFonts w:ascii="Arial" w:cs="Arial" w:eastAsia="Arial" w:hAnsi="Arial"/>
+          <w:color w:val="1C1A17"/>
+          <w:sz w:val="19"/>
+          <w:szCs w:val="19"/>
+        </w:rPr>
+        <w:t xml:space="preserve">   Brand guidelines (colours, fonts)</w:t>
+      </w:r>
+    </w:p>
+    <w:p>
+      <w:pPr>
+        <w:spacing w:after="40"/>
+        <w:ind w:left="120"/>
+      </w:pPr>
+      <w:r>
+        <w:rPr>
+          <w:rFonts w:ascii="DejaVu Sans" w:cs="DejaVu Sans" w:eastAsia="DejaVu Sans" w:hAnsi="DejaVu Sans"/>
+          <w:color w:val="1C1A17"/>
+          <w:sz w:val="22"/>
+          <w:szCs w:val="22"/>
+        </w:rPr>
+        <w:t xml:space="preserve">☐</w:t>
+      </w:r>
+      <w:r>
+        <w:rPr>
+          <w:rFonts w:ascii="Arial" w:cs="Arial" w:eastAsia="Arial" w:hAnsi="Arial"/>
+          <w:color w:val="1C1A17"/>
+          <w:sz w:val="19"/>
+          <w:szCs w:val="19"/>
+        </w:rPr>
+        <w:t xml:space="preserve">   Photos and key messages for the walls</w:t>
+      </w:r>
+    </w:p>
+    <w:p>
+      <w:pPr>
+        <w:spacing w:after="40"/>
+        <w:ind w:left="120"/>
+      </w:pPr>
+      <w:r>
+        <w:rPr>
+          <w:rFonts w:ascii="DejaVu Sans" w:cs="DejaVu Sans" w:eastAsia="DejaVu Sans" w:hAnsi="DejaVu Sans"/>
+          <w:color w:val="1C1A17"/>
+          <w:sz w:val="22"/>
+          <w:szCs w:val="22"/>
+        </w:rPr>
+        <w:t xml:space="preserve">☐</w:t>
+      </w:r>
+      <w:r>
+        <w:rPr>
+          <w:rFonts w:ascii="Arial" w:cs="Arial" w:eastAsia="Arial" w:hAnsi="Arial"/>
+          <w:color w:val="1C1A17"/>
+          <w:sz w:val="19"/>
+          <w:szCs w:val="19"/>
+        </w:rPr>
+        <w:t xml:space="preserve">   Photos of past stands, if you have them</w:t>
+      </w:r>
+    </w:p>
+    <w:p>
+      <w:pPr>
+        <w:spacing w:after="100"/>
+      </w:pPr>
     </w:p>
     <w:tbl>
       <w:tblPr>
@@ -1396,189 +1342,6 @@
         <w:gridCol w:w="3600"/>
         <w:gridCol w:w="6038"/>
       </w:tblGrid>
-      <w:tr>
-        <w:trPr>
-          <w:trHeight w:val="520" w:hRule="atLeast"/>
-        </w:trPr>
-        <w:tc>
-          <w:tcPr>
-            <w:tcW w:type="dxa" w:w="3600"/>
-            <w:tcBorders>
-              <w:top w:val="none" w:color="FFFFFF" w:sz="0"/>
-              <w:left w:val="none" w:color="FFFFFF" w:sz="0"/>
-              <w:bottom w:val="single" w:color="D8D1C5" w:sz="4"/>
-              <w:right w:val="none" w:color="FFFFFF" w:sz="0"/>
-            </w:tcBorders>
-            <w:shd w:fill="F5F2EC" w:color="auto" w:val="clear"/>
-            <w:tcMar>
-              <w:top w:type="dxa" w:w="90"/>
-              <w:left w:type="dxa" w:w="120"/>
-              <w:bottom w:type="dxa" w:w="90"/>
-              <w:right w:type="dxa" w:w="120"/>
-            </w:tcMar>
-          </w:tcPr>
-          <w:p>
-            <w:r>
-              <w:rPr>
-                <w:rFonts w:ascii="Arial" w:cs="Arial" w:eastAsia="Arial" w:hAnsi="Arial"/>
-                <w:color w:val="1C1A17"/>
-                <w:sz w:val="19"/>
-                <w:szCs w:val="19"/>
-              </w:rPr>
-              <w:t xml:space="preserve">Logo as vector file (AI, EPS, SVG or PDF)</w:t>
-            </w:r>
-          </w:p>
-        </w:tc>
-        <w:tc>
-          <w:tcPr>
-            <w:tcW w:type="dxa" w:w="6038"/>
-            <w:tcBorders>
-              <w:top w:val="none" w:color="FFFFFF" w:sz="0"/>
-              <w:left w:val="none" w:color="FFFFFF" w:sz="0"/>
-              <w:bottom w:val="single" w:color="D8D1C5" w:sz="4"/>
-              <w:right w:val="none" w:color="FFFFFF" w:sz="0"/>
-            </w:tcBorders>
-            <w:tcMar>
-              <w:top w:type="dxa" w:w="90"/>
-              <w:left w:type="dxa" w:w="160"/>
-              <w:bottom w:type="dxa" w:w="90"/>
-              <w:right w:type="dxa" w:w="120"/>
-            </w:tcMar>
-          </w:tcPr>
-          <w:p>
-            <w:r>
-              <w:rPr>
-                <w:rFonts w:ascii="Arial" w:cs="Arial" w:eastAsia="Arial" w:hAnsi="Arial"/>
-                <w:sz w:val="20"/>
-                <w:szCs w:val="20"/>
-              </w:rPr>
-              <w:t xml:space="preserve"/>
-            </w:r>
-          </w:p>
-        </w:tc>
-      </w:tr>
-      <w:tr>
-        <w:trPr>
-          <w:trHeight w:val="520" w:hRule="atLeast"/>
-        </w:trPr>
-        <w:tc>
-          <w:tcPr>
-            <w:tcW w:type="dxa" w:w="3600"/>
-            <w:tcBorders>
-              <w:top w:val="none" w:color="FFFFFF" w:sz="0"/>
-              <w:left w:val="none" w:color="FFFFFF" w:sz="0"/>
-              <w:bottom w:val="single" w:color="D8D1C5" w:sz="4"/>
-              <w:right w:val="none" w:color="FFFFFF" w:sz="0"/>
-            </w:tcBorders>
-            <w:shd w:fill="F5F2EC" w:color="auto" w:val="clear"/>
-            <w:tcMar>
-              <w:top w:type="dxa" w:w="90"/>
-              <w:left w:type="dxa" w:w="120"/>
-              <w:bottom w:type="dxa" w:w="90"/>
-              <w:right w:type="dxa" w:w="120"/>
-            </w:tcMar>
-          </w:tcPr>
-          <w:p>
-            <w:r>
-              <w:rPr>
-                <w:rFonts w:ascii="Arial" w:cs="Arial" w:eastAsia="Arial" w:hAnsi="Arial"/>
-                <w:color w:val="1C1A17"/>
-                <w:sz w:val="19"/>
-                <w:szCs w:val="19"/>
-              </w:rPr>
-              <w:t xml:space="preserve">Brand guidelines (colours, fonts)</w:t>
-            </w:r>
-          </w:p>
-        </w:tc>
-        <w:tc>
-          <w:tcPr>
-            <w:tcW w:type="dxa" w:w="6038"/>
-            <w:tcBorders>
-              <w:top w:val="none" w:color="FFFFFF" w:sz="0"/>
-              <w:left w:val="none" w:color="FFFFFF" w:sz="0"/>
-              <w:bottom w:val="single" w:color="D8D1C5" w:sz="4"/>
-              <w:right w:val="none" w:color="FFFFFF" w:sz="0"/>
-            </w:tcBorders>
-            <w:tcMar>
-              <w:top w:type="dxa" w:w="90"/>
-              <w:left w:type="dxa" w:w="160"/>
-              <w:bottom w:type="dxa" w:w="90"/>
-              <w:right w:type="dxa" w:w="120"/>
-            </w:tcMar>
-          </w:tcPr>
-          <w:p>
-            <w:r>
-              <w:rPr>
-                <w:rFonts w:ascii="Arial" w:cs="Arial" w:eastAsia="Arial" w:hAnsi="Arial"/>
-                <w:sz w:val="20"/>
-                <w:szCs w:val="20"/>
-              </w:rPr>
-              <w:t xml:space="preserve"/>
-            </w:r>
-          </w:p>
-        </w:tc>
-      </w:tr>
-      <w:tr>
-        <w:trPr>
-          <w:trHeight w:val="520" w:hRule="atLeast"/>
-        </w:trPr>
-        <w:tc>
-          <w:tcPr>
-            <w:tcW w:type="dxa" w:w="3600"/>
-            <w:tcBorders>
-              <w:top w:val="none" w:color="FFFFFF" w:sz="0"/>
-              <w:left w:val="none" w:color="FFFFFF" w:sz="0"/>
-              <w:bottom w:val="single" w:color="D8D1C5" w:sz="4"/>
-              <w:right w:val="none" w:color="FFFFFF" w:sz="0"/>
-            </w:tcBorders>
-            <w:shd w:fill="F5F2EC" w:color="auto" w:val="clear"/>
-            <w:tcMar>
-              <w:top w:type="dxa" w:w="90"/>
-              <w:left w:type="dxa" w:w="120"/>
-              <w:bottom w:type="dxa" w:w="90"/>
-              <w:right w:type="dxa" w:w="120"/>
-            </w:tcMar>
-          </w:tcPr>
-          <w:p>
-            <w:r>
-              <w:rPr>
-                <w:rFonts w:ascii="Arial" w:cs="Arial" w:eastAsia="Arial" w:hAnsi="Arial"/>
-                <w:color w:val="1C1A17"/>
-                <w:sz w:val="19"/>
-                <w:szCs w:val="19"/>
-              </w:rPr>
-              <w:t xml:space="preserve">Photos and key messages for the walls</w:t>
-            </w:r>
-          </w:p>
-        </w:tc>
-        <w:tc>
-          <w:tcPr>
-            <w:tcW w:type="dxa" w:w="6038"/>
-            <w:tcBorders>
-              <w:top w:val="none" w:color="FFFFFF" w:sz="0"/>
-              <w:left w:val="none" w:color="FFFFFF" w:sz="0"/>
-              <w:bottom w:val="single" w:color="D8D1C5" w:sz="4"/>
-              <w:right w:val="none" w:color="FFFFFF" w:sz="0"/>
-            </w:tcBorders>
-            <w:tcMar>
-              <w:top w:type="dxa" w:w="90"/>
-              <w:left w:type="dxa" w:w="160"/>
-              <w:bottom w:type="dxa" w:w="90"/>
-              <w:right w:type="dxa" w:w="120"/>
-            </w:tcMar>
-          </w:tcPr>
-          <w:p>
-            <w:r>
-              <w:rPr>
-                <w:rFonts w:ascii="Arial" w:cs="Arial" w:eastAsia="Arial" w:hAnsi="Arial"/>
-                <w:sz w:val="20"/>
-                <w:szCs w:val="20"/>
-              </w:rPr>
-              <w:t xml:space="preserve"/>
-            </w:r>
-          </w:p>
-        </w:tc>
-      </w:tr>
       <w:tr>
         <w:trPr>
           <w:trHeight w:val="520" w:hRule="atLeast"/>

</xml_diff>

<commit_message>
Brief templates: new logo
Co-Authored-By: Claude Opus 5.5 <noreply@anthropic.com>
Claude-Session: https://claude.ai/code/session_01B97nPoqq1BTtbztXedy2HT
</commit_message>
<xml_diff>
--- a/downloads/1o1expo-stand-brief-template.docx
+++ b/downloads/1o1expo-stand-brief-template.docx
@@ -9,7 +9,7 @@
       <w:r>
         <w:drawing>
           <wp:inline distT="0" distB="0" distL="0" distR="0">
-            <wp:extent cx="1428750" cy="438150"/>
+            <wp:extent cx="1485900" cy="438150"/>
             <wp:effectExtent t="0" r="0" b="0" l="0"/>
             <wp:docPr id="1" name="" descr="" title=""/>
             <wp:cNvGraphicFramePr>
@@ -34,7 +34,7 @@
                   <pic:spPr bwMode="auto">
                     <a:xfrm>
                       <a:off x="0" y="0"/>
-                      <a:ext cx="1428750" cy="438150"/>
+                      <a:ext cx="1485900" cy="438150"/>
                     </a:xfrm>
                     <a:prstGeom prst="rect">
                       <a:avLst/>

</xml_diff>

<commit_message>
Brief templates: fit on two pages in Word (no blank third page)
Co-Authored-By: Claude Opus 5.5 <noreply@anthropic.com>
Claude-Session: https://claude.ai/code/session_01B97nPoqq1BTtbztXedy2HT
</commit_message>
<xml_diff>
--- a/downloads/1o1expo-stand-brief-template.docx
+++ b/downloads/1o1expo-stand-brief-template.docx
@@ -116,7 +116,7 @@
       </w:tblGrid>
       <w:tr>
         <w:trPr>
-          <w:trHeight w:val="520" w:hRule="atLeast"/>
+          <w:trHeight w:val="480" w:hRule="atLeast"/>
         </w:trPr>
         <w:tc>
           <w:tcPr>
@@ -177,7 +177,7 @@
       </w:tr>
       <w:tr>
         <w:trPr>
-          <w:trHeight w:val="520" w:hRule="atLeast"/>
+          <w:trHeight w:val="480" w:hRule="atLeast"/>
         </w:trPr>
         <w:tc>
           <w:tcPr>
@@ -238,7 +238,7 @@
       </w:tr>
       <w:tr>
         <w:trPr>
-          <w:trHeight w:val="520" w:hRule="atLeast"/>
+          <w:trHeight w:val="480" w:hRule="atLeast"/>
         </w:trPr>
         <w:tc>
           <w:tcPr>
@@ -310,7 +310,7 @@
       </w:tr>
       <w:tr>
         <w:trPr>
-          <w:trHeight w:val="520" w:hRule="atLeast"/>
+          <w:trHeight w:val="480" w:hRule="atLeast"/>
         </w:trPr>
         <w:tc>
           <w:tcPr>
@@ -406,7 +406,7 @@
       </w:tblGrid>
       <w:tr>
         <w:trPr>
-          <w:trHeight w:val="520" w:hRule="atLeast"/>
+          <w:trHeight w:val="480" w:hRule="atLeast"/>
         </w:trPr>
         <w:tc>
           <w:tcPr>
@@ -478,7 +478,7 @@
       </w:tr>
       <w:tr>
         <w:trPr>
-          <w:trHeight w:val="520" w:hRule="atLeast"/>
+          <w:trHeight w:val="480" w:hRule="atLeast"/>
         </w:trPr>
         <w:tc>
           <w:tcPr>
@@ -539,7 +539,7 @@
       </w:tr>
       <w:tr>
         <w:trPr>
-          <w:trHeight w:val="520" w:hRule="atLeast"/>
+          <w:trHeight w:val="480" w:hRule="atLeast"/>
         </w:trPr>
         <w:tc>
           <w:tcPr>
@@ -600,7 +600,7 @@
       </w:tr>
       <w:tr>
         <w:trPr>
-          <w:trHeight w:val="520" w:hRule="atLeast"/>
+          <w:trHeight w:val="480" w:hRule="atLeast"/>
         </w:trPr>
         <w:tc>
           <w:tcPr>
@@ -672,7 +672,7 @@
       </w:tr>
       <w:tr>
         <w:trPr>
-          <w:trHeight w:val="520" w:hRule="atLeast"/>
+          <w:trHeight w:val="480" w:hRule="atLeast"/>
         </w:trPr>
         <w:tc>
           <w:tcPr>
@@ -744,7 +744,7 @@
       </w:tr>
       <w:tr>
         <w:trPr>
-          <w:trHeight w:val="520" w:hRule="atLeast"/>
+          <w:trHeight w:val="480" w:hRule="atLeast"/>
         </w:trPr>
         <w:tc>
           <w:tcPr>
@@ -840,7 +840,7 @@
       </w:tblGrid>
       <w:tr>
         <w:trPr>
-          <w:trHeight w:val="520" w:hRule="atLeast"/>
+          <w:trHeight w:val="480" w:hRule="atLeast"/>
         </w:trPr>
         <w:tc>
           <w:tcPr>
@@ -901,7 +901,7 @@
       </w:tr>
       <w:tr>
         <w:trPr>
-          <w:trHeight w:val="520" w:hRule="atLeast"/>
+          <w:trHeight w:val="480" w:hRule="atLeast"/>
         </w:trPr>
         <w:tc>
           <w:tcPr>
@@ -962,7 +962,7 @@
       </w:tr>
       <w:tr>
         <w:trPr>
-          <w:trHeight w:val="520" w:hRule="atLeast"/>
+          <w:trHeight w:val="480" w:hRule="atLeast"/>
         </w:trPr>
         <w:tc>
           <w:tcPr>
@@ -1023,7 +1023,7 @@
       </w:tr>
       <w:tr>
         <w:trPr>
-          <w:trHeight w:val="520" w:hRule="atLeast"/>
+          <w:trHeight w:val="480" w:hRule="atLeast"/>
         </w:trPr>
         <w:tc>
           <w:tcPr>
@@ -1099,6 +1099,642 @@
           <w:szCs w:val="18"/>
         </w:rPr>
         <w:t xml:space="preserve">3  WHAT THE STAND MUST HOLD</w:t>
+      </w:r>
+    </w:p>
+    <w:tbl>
+      <w:tblPr>
+        <w:tblW w:type="dxa" w:w="9638"/>
+        <w:tblBorders>
+          <w:top w:val="single" w:color="D8D1C5" w:sz="4"/>
+          <w:left w:val="none" w:color="FFFFFF" w:sz="0"/>
+          <w:bottom w:val="none" w:color="FFFFFF" w:sz="0"/>
+          <w:right w:val="none" w:color="FFFFFF" w:sz="0"/>
+          <w:insideH w:val="none" w:color="FFFFFF" w:sz="0"/>
+          <w:insideV w:val="none" w:color="FFFFFF" w:sz="0"/>
+        </w:tblBorders>
+      </w:tblPr>
+      <w:tblGrid>
+        <w:gridCol w:w="3600"/>
+        <w:gridCol w:w="6038"/>
+      </w:tblGrid>
+      <w:tr>
+        <w:trPr>
+          <w:trHeight w:val="2200" w:hRule="atLeast"/>
+        </w:trPr>
+        <w:tc>
+          <w:tcPr>
+            <w:tcW w:type="dxa" w:w="3600"/>
+            <w:tcBorders>
+              <w:top w:val="none" w:color="FFFFFF" w:sz="0"/>
+              <w:left w:val="none" w:color="FFFFFF" w:sz="0"/>
+              <w:bottom w:val="single" w:color="D8D1C5" w:sz="4"/>
+              <w:right w:val="none" w:color="FFFFFF" w:sz="0"/>
+            </w:tcBorders>
+            <w:shd w:fill="F5F2EC" w:color="auto" w:val="clear"/>
+            <w:tcMar>
+              <w:top w:type="dxa" w:w="90"/>
+              <w:left w:type="dxa" w:w="120"/>
+              <w:bottom w:type="dxa" w:w="90"/>
+              <w:right w:type="dxa" w:w="120"/>
+            </w:tcMar>
+          </w:tcPr>
+          <w:p>
+            <w:r>
+              <w:rPr>
+                <w:rFonts w:ascii="Arial" w:cs="Arial" w:eastAsia="Arial" w:hAnsi="Arial"/>
+                <w:color w:val="1C1A17"/>
+                <w:sz w:val="19"/>
+                <w:szCs w:val="19"/>
+              </w:rPr>
+              <w:t xml:space="preserve">What the stand must hold</w:t>
+            </w:r>
+          </w:p>
+          <w:p>
+            <w:pPr>
+              <w:spacing w:before="80"/>
+            </w:pPr>
+            <w:r>
+              <w:rPr>
+                <w:rFonts w:ascii="Arial" w:cs="Arial" w:eastAsia="Arial" w:hAnsi="Arial"/>
+                <w:color w:val="5B5650"/>
+                <w:sz w:val="16"/>
+                <w:szCs w:val="16"/>
+              </w:rPr>
+              <w:t xml:space="preserve">For example: products to show (with sizes and weights), screens, counters, shelves, a meeting area (open or closed, how many seats), a storage room, a kitchen or a bar.</w:t>
+            </w:r>
+          </w:p>
+        </w:tc>
+        <w:tc>
+          <w:tcPr>
+            <w:tcW w:type="dxa" w:w="6038"/>
+            <w:tcBorders>
+              <w:top w:val="none" w:color="FFFFFF" w:sz="0"/>
+              <w:left w:val="none" w:color="FFFFFF" w:sz="0"/>
+              <w:bottom w:val="single" w:color="D8D1C5" w:sz="4"/>
+              <w:right w:val="none" w:color="FFFFFF" w:sz="0"/>
+            </w:tcBorders>
+            <w:tcMar>
+              <w:top w:type="dxa" w:w="90"/>
+              <w:left w:type="dxa" w:w="160"/>
+              <w:bottom w:type="dxa" w:w="90"/>
+              <w:right w:type="dxa" w:w="120"/>
+            </w:tcMar>
+          </w:tcPr>
+          <w:p>
+            <w:r>
+              <w:rPr>
+                <w:rFonts w:ascii="Arial" w:cs="Arial" w:eastAsia="Arial" w:hAnsi="Arial"/>
+                <w:sz w:val="20"/>
+                <w:szCs w:val="20"/>
+              </w:rPr>
+              <w:t xml:space="preserve"/>
+            </w:r>
+          </w:p>
+        </w:tc>
+      </w:tr>
+    </w:tbl>
+    <w:p>
+      <w:pPr>
+        <w:keepNext/>
+        <w:pageBreakBefore/>
+        <w:spacing w:after="100" w:before="260"/>
+      </w:pPr>
+      <w:r>
+        <w:rPr>
+          <w:rFonts w:ascii="Arial" w:cs="Arial" w:eastAsia="Arial" w:hAnsi="Arial"/>
+          <w:b/>
+          <w:bCs/>
+          <w:color w:val="13704D"/>
+          <w:spacing w:val="20"/>
+          <w:sz w:val="18"/>
+          <w:szCs w:val="18"/>
+        </w:rPr>
+        <w:t xml:space="preserve">4  YOUR BRAND</w:t>
+      </w:r>
+    </w:p>
+    <w:p>
+      <w:pPr>
+        <w:spacing w:after="60"/>
+      </w:pPr>
+      <w:r>
+        <w:rPr>
+          <w:rFonts w:ascii="Arial" w:cs="Arial" w:eastAsia="Arial" w:hAnsi="Arial"/>
+          <w:color w:val="1C1A17"/>
+          <w:sz w:val="19"/>
+          <w:szCs w:val="19"/>
+        </w:rPr>
+        <w:t xml:space="preserve">Please attach to your email what you have:</w:t>
+      </w:r>
+    </w:p>
+    <w:p>
+      <w:pPr>
+        <w:spacing w:after="40"/>
+        <w:ind w:left="120"/>
+      </w:pPr>
+      <w:r>
+        <w:rPr>
+          <w:rFonts w:ascii="DejaVu Sans" w:cs="DejaVu Sans" w:eastAsia="DejaVu Sans" w:hAnsi="DejaVu Sans"/>
+          <w:color w:val="1C1A17"/>
+          <w:sz w:val="22"/>
+          <w:szCs w:val="22"/>
+        </w:rPr>
+        <w:t xml:space="preserve">☐</w:t>
+      </w:r>
+      <w:r>
+        <w:rPr>
+          <w:rFonts w:ascii="Arial" w:cs="Arial" w:eastAsia="Arial" w:hAnsi="Arial"/>
+          <w:color w:val="1C1A17"/>
+          <w:sz w:val="19"/>
+          <w:szCs w:val="19"/>
+        </w:rPr>
+        <w:t xml:space="preserve">   Logo as a vector file (AI, EPS, SVG or PDF)</w:t>
+      </w:r>
+    </w:p>
+    <w:p>
+      <w:pPr>
+        <w:spacing w:after="40"/>
+        <w:ind w:left="120"/>
+      </w:pPr>
+      <w:r>
+        <w:rPr>
+          <w:rFonts w:ascii="DejaVu Sans" w:cs="DejaVu Sans" w:eastAsia="DejaVu Sans" w:hAnsi="DejaVu Sans"/>
+          <w:color w:val="1C1A17"/>
+          <w:sz w:val="22"/>
+          <w:szCs w:val="22"/>
+        </w:rPr>
+        <w:t xml:space="preserve">☐</w:t>
+      </w:r>
+      <w:r>
+        <w:rPr>
+          <w:rFonts w:ascii="Arial" w:cs="Arial" w:eastAsia="Arial" w:hAnsi="Arial"/>
+          <w:color w:val="1C1A17"/>
+          <w:sz w:val="19"/>
+          <w:szCs w:val="19"/>
+        </w:rPr>
+        <w:t xml:space="preserve">   Brand guidelines (colours, fonts)</w:t>
+      </w:r>
+    </w:p>
+    <w:p>
+      <w:pPr>
+        <w:spacing w:after="40"/>
+        <w:ind w:left="120"/>
+      </w:pPr>
+      <w:r>
+        <w:rPr>
+          <w:rFonts w:ascii="DejaVu Sans" w:cs="DejaVu Sans" w:eastAsia="DejaVu Sans" w:hAnsi="DejaVu Sans"/>
+          <w:color w:val="1C1A17"/>
+          <w:sz w:val="22"/>
+          <w:szCs w:val="22"/>
+        </w:rPr>
+        <w:t xml:space="preserve">☐</w:t>
+      </w:r>
+      <w:r>
+        <w:rPr>
+          <w:rFonts w:ascii="Arial" w:cs="Arial" w:eastAsia="Arial" w:hAnsi="Arial"/>
+          <w:color w:val="1C1A17"/>
+          <w:sz w:val="19"/>
+          <w:szCs w:val="19"/>
+        </w:rPr>
+        <w:t xml:space="preserve">   Photos and key messages for the walls</w:t>
+      </w:r>
+    </w:p>
+    <w:p>
+      <w:pPr>
+        <w:spacing w:after="40"/>
+        <w:ind w:left="120"/>
+      </w:pPr>
+      <w:r>
+        <w:rPr>
+          <w:rFonts w:ascii="DejaVu Sans" w:cs="DejaVu Sans" w:eastAsia="DejaVu Sans" w:hAnsi="DejaVu Sans"/>
+          <w:color w:val="1C1A17"/>
+          <w:sz w:val="22"/>
+          <w:szCs w:val="22"/>
+        </w:rPr>
+        <w:t xml:space="preserve">☐</w:t>
+      </w:r>
+      <w:r>
+        <w:rPr>
+          <w:rFonts w:ascii="Arial" w:cs="Arial" w:eastAsia="Arial" w:hAnsi="Arial"/>
+          <w:color w:val="1C1A17"/>
+          <w:sz w:val="19"/>
+          <w:szCs w:val="19"/>
+        </w:rPr>
+        <w:t xml:space="preserve">   Photos of past stands, if you have them</w:t>
+      </w:r>
+    </w:p>
+    <w:p>
+      <w:pPr>
+        <w:spacing w:after="100"/>
+      </w:pPr>
+    </w:p>
+    <w:tbl>
+      <w:tblPr>
+        <w:tblW w:type="dxa" w:w="9638"/>
+        <w:tblBorders>
+          <w:top w:val="single" w:color="D8D1C5" w:sz="4"/>
+          <w:left w:val="none" w:color="FFFFFF" w:sz="0"/>
+          <w:bottom w:val="none" w:color="FFFFFF" w:sz="0"/>
+          <w:right w:val="none" w:color="FFFFFF" w:sz="0"/>
+          <w:insideH w:val="none" w:color="FFFFFF" w:sz="0"/>
+          <w:insideV w:val="none" w:color="FFFFFF" w:sz="0"/>
+        </w:tblBorders>
+      </w:tblPr>
+      <w:tblGrid>
+        <w:gridCol w:w="3600"/>
+        <w:gridCol w:w="6038"/>
+      </w:tblGrid>
+      <w:tr>
+        <w:trPr>
+          <w:trHeight w:val="480" w:hRule="atLeast"/>
+        </w:trPr>
+        <w:tc>
+          <w:tcPr>
+            <w:tcW w:type="dxa" w:w="3600"/>
+            <w:tcBorders>
+              <w:top w:val="none" w:color="FFFFFF" w:sz="0"/>
+              <w:left w:val="none" w:color="FFFFFF" w:sz="0"/>
+              <w:bottom w:val="single" w:color="D8D1C5" w:sz="4"/>
+              <w:right w:val="none" w:color="FFFFFF" w:sz="0"/>
+            </w:tcBorders>
+            <w:shd w:fill="F5F2EC" w:color="auto" w:val="clear"/>
+            <w:tcMar>
+              <w:top w:type="dxa" w:w="90"/>
+              <w:left w:type="dxa" w:w="120"/>
+              <w:bottom w:type="dxa" w:w="90"/>
+              <w:right w:type="dxa" w:w="120"/>
+            </w:tcMar>
+          </w:tcPr>
+          <w:p>
+            <w:r>
+              <w:rPr>
+                <w:rFonts w:ascii="Arial" w:cs="Arial" w:eastAsia="Arial" w:hAnsi="Arial"/>
+                <w:color w:val="1C1A17"/>
+                <w:sz w:val="19"/>
+                <w:szCs w:val="19"/>
+              </w:rPr>
+              <w:t xml:space="preserve">Past stands: what you liked, what you didn't</w:t>
+            </w:r>
+          </w:p>
+        </w:tc>
+        <w:tc>
+          <w:tcPr>
+            <w:tcW w:type="dxa" w:w="6038"/>
+            <w:tcBorders>
+              <w:top w:val="none" w:color="FFFFFF" w:sz="0"/>
+              <w:left w:val="none" w:color="FFFFFF" w:sz="0"/>
+              <w:bottom w:val="single" w:color="D8D1C5" w:sz="4"/>
+              <w:right w:val="none" w:color="FFFFFF" w:sz="0"/>
+            </w:tcBorders>
+            <w:tcMar>
+              <w:top w:type="dxa" w:w="90"/>
+              <w:left w:type="dxa" w:w="160"/>
+              <w:bottom w:type="dxa" w:w="90"/>
+              <w:right w:type="dxa" w:w="120"/>
+            </w:tcMar>
+          </w:tcPr>
+          <w:p>
+            <w:r>
+              <w:rPr>
+                <w:rFonts w:ascii="Arial" w:cs="Arial" w:eastAsia="Arial" w:hAnsi="Arial"/>
+                <w:sz w:val="20"/>
+                <w:szCs w:val="20"/>
+              </w:rPr>
+              <w:t xml:space="preserve"/>
+            </w:r>
+          </w:p>
+        </w:tc>
+      </w:tr>
+    </w:tbl>
+    <w:p>
+      <w:pPr>
+        <w:keepNext/>
+        <w:spacing w:after="100" w:before="260"/>
+      </w:pPr>
+      <w:r>
+        <w:rPr>
+          <w:rFonts w:ascii="Arial" w:cs="Arial" w:eastAsia="Arial" w:hAnsi="Arial"/>
+          <w:b/>
+          <w:bCs/>
+          <w:color w:val="13704D"/>
+          <w:spacing w:val="20"/>
+          <w:sz w:val="18"/>
+          <w:szCs w:val="18"/>
+        </w:rPr>
+        <w:t xml:space="preserve">5  BUDGET</w:t>
+      </w:r>
+    </w:p>
+    <w:tbl>
+      <w:tblPr>
+        <w:tblW w:type="dxa" w:w="9638"/>
+        <w:tblBorders>
+          <w:top w:val="single" w:color="D8D1C5" w:sz="4"/>
+          <w:left w:val="none" w:color="FFFFFF" w:sz="0"/>
+          <w:bottom w:val="none" w:color="FFFFFF" w:sz="0"/>
+          <w:right w:val="none" w:color="FFFFFF" w:sz="0"/>
+          <w:insideH w:val="none" w:color="FFFFFF" w:sz="0"/>
+          <w:insideV w:val="none" w:color="FFFFFF" w:sz="0"/>
+        </w:tblBorders>
+      </w:tblPr>
+      <w:tblGrid>
+        <w:gridCol w:w="3600"/>
+        <w:gridCol w:w="6038"/>
+      </w:tblGrid>
+      <w:tr>
+        <w:trPr>
+          <w:trHeight w:val="480" w:hRule="atLeast"/>
+        </w:trPr>
+        <w:tc>
+          <w:tcPr>
+            <w:tcW w:type="dxa" w:w="3600"/>
+            <w:tcBorders>
+              <w:top w:val="none" w:color="FFFFFF" w:sz="0"/>
+              <w:left w:val="none" w:color="FFFFFF" w:sz="0"/>
+              <w:bottom w:val="single" w:color="D8D1C5" w:sz="4"/>
+              <w:right w:val="none" w:color="FFFFFF" w:sz="0"/>
+            </w:tcBorders>
+            <w:shd w:fill="F5F2EC" w:color="auto" w:val="clear"/>
+            <w:tcMar>
+              <w:top w:type="dxa" w:w="90"/>
+              <w:left w:type="dxa" w:w="120"/>
+              <w:bottom w:type="dxa" w:w="90"/>
+              <w:right w:type="dxa" w:w="120"/>
+            </w:tcMar>
+          </w:tcPr>
+          <w:p>
+            <w:r>
+              <w:rPr>
+                <w:rFonts w:ascii="Arial" w:cs="Arial" w:eastAsia="Arial" w:hAnsi="Arial"/>
+                <w:color w:val="1C1A17"/>
+                <w:sz w:val="19"/>
+                <w:szCs w:val="19"/>
+              </w:rPr>
+              <w:t xml:space="preserve">Budget range for the whole project</w:t>
+            </w:r>
+          </w:p>
+        </w:tc>
+        <w:tc>
+          <w:tcPr>
+            <w:tcW w:type="dxa" w:w="6038"/>
+            <w:tcBorders>
+              <w:top w:val="none" w:color="FFFFFF" w:sz="0"/>
+              <w:left w:val="none" w:color="FFFFFF" w:sz="0"/>
+              <w:bottom w:val="single" w:color="D8D1C5" w:sz="4"/>
+              <w:right w:val="none" w:color="FFFFFF" w:sz="0"/>
+            </w:tcBorders>
+            <w:tcMar>
+              <w:top w:type="dxa" w:w="90"/>
+              <w:left w:type="dxa" w:w="160"/>
+              <w:bottom w:type="dxa" w:w="90"/>
+              <w:right w:type="dxa" w:w="120"/>
+            </w:tcMar>
+          </w:tcPr>
+          <w:p>
+            <w:r>
+              <w:rPr>
+                <w:rFonts w:ascii="Arial" w:cs="Arial" w:eastAsia="Arial" w:hAnsi="Arial"/>
+                <w:sz w:val="20"/>
+                <w:szCs w:val="20"/>
+              </w:rPr>
+              <w:t xml:space="preserve"/>
+            </w:r>
+          </w:p>
+        </w:tc>
+      </w:tr>
+    </w:tbl>
+    <w:p>
+      <w:pPr>
+        <w:keepNext/>
+        <w:spacing w:after="100" w:before="260"/>
+      </w:pPr>
+      <w:r>
+        <w:rPr>
+          <w:rFonts w:ascii="Arial" w:cs="Arial" w:eastAsia="Arial" w:hAnsi="Arial"/>
+          <w:b/>
+          <w:bCs/>
+          <w:color w:val="13704D"/>
+          <w:spacing w:val="20"/>
+          <w:sz w:val="18"/>
+          <w:szCs w:val="18"/>
+        </w:rPr>
+        <w:t xml:space="preserve">6  DATES AND DECISIONS</w:t>
+      </w:r>
+    </w:p>
+    <w:tbl>
+      <w:tblPr>
+        <w:tblW w:type="dxa" w:w="9638"/>
+        <w:tblBorders>
+          <w:top w:val="single" w:color="D8D1C5" w:sz="4"/>
+          <w:left w:val="none" w:color="FFFFFF" w:sz="0"/>
+          <w:bottom w:val="none" w:color="FFFFFF" w:sz="0"/>
+          <w:right w:val="none" w:color="FFFFFF" w:sz="0"/>
+          <w:insideH w:val="none" w:color="FFFFFF" w:sz="0"/>
+          <w:insideV w:val="none" w:color="FFFFFF" w:sz="0"/>
+        </w:tblBorders>
+      </w:tblPr>
+      <w:tblGrid>
+        <w:gridCol w:w="3600"/>
+        <w:gridCol w:w="6038"/>
+      </w:tblGrid>
+      <w:tr>
+        <w:trPr>
+          <w:trHeight w:val="480" w:hRule="atLeast"/>
+        </w:trPr>
+        <w:tc>
+          <w:tcPr>
+            <w:tcW w:type="dxa" w:w="3600"/>
+            <w:tcBorders>
+              <w:top w:val="none" w:color="FFFFFF" w:sz="0"/>
+              <w:left w:val="none" w:color="FFFFFF" w:sz="0"/>
+              <w:bottom w:val="single" w:color="D8D1C5" w:sz="4"/>
+              <w:right w:val="none" w:color="FFFFFF" w:sz="0"/>
+            </w:tcBorders>
+            <w:shd w:fill="F5F2EC" w:color="auto" w:val="clear"/>
+            <w:tcMar>
+              <w:top w:type="dxa" w:w="90"/>
+              <w:left w:type="dxa" w:w="120"/>
+              <w:bottom w:type="dxa" w:w="90"/>
+              <w:right w:type="dxa" w:w="120"/>
+            </w:tcMar>
+          </w:tcPr>
+          <w:p>
+            <w:r>
+              <w:rPr>
+                <w:rFonts w:ascii="Arial" w:cs="Arial" w:eastAsia="Arial" w:hAnsi="Arial"/>
+                <w:color w:val="1C1A17"/>
+                <w:sz w:val="19"/>
+                <w:szCs w:val="19"/>
+              </w:rPr>
+              <w:t xml:space="preserve">First design needed by</w:t>
+            </w:r>
+          </w:p>
+        </w:tc>
+        <w:tc>
+          <w:tcPr>
+            <w:tcW w:type="dxa" w:w="6038"/>
+            <w:tcBorders>
+              <w:top w:val="none" w:color="FFFFFF" w:sz="0"/>
+              <w:left w:val="none" w:color="FFFFFF" w:sz="0"/>
+              <w:bottom w:val="single" w:color="D8D1C5" w:sz="4"/>
+              <w:right w:val="none" w:color="FFFFFF" w:sz="0"/>
+            </w:tcBorders>
+            <w:tcMar>
+              <w:top w:type="dxa" w:w="90"/>
+              <w:left w:type="dxa" w:w="160"/>
+              <w:bottom w:type="dxa" w:w="90"/>
+              <w:right w:type="dxa" w:w="120"/>
+            </w:tcMar>
+          </w:tcPr>
+          <w:p>
+            <w:r>
+              <w:rPr>
+                <w:rFonts w:ascii="Arial" w:cs="Arial" w:eastAsia="Arial" w:hAnsi="Arial"/>
+                <w:sz w:val="20"/>
+                <w:szCs w:val="20"/>
+              </w:rPr>
+              <w:t xml:space="preserve"/>
+            </w:r>
+          </w:p>
+        </w:tc>
+      </w:tr>
+      <w:tr>
+        <w:trPr>
+          <w:trHeight w:val="480" w:hRule="atLeast"/>
+        </w:trPr>
+        <w:tc>
+          <w:tcPr>
+            <w:tcW w:type="dxa" w:w="3600"/>
+            <w:tcBorders>
+              <w:top w:val="none" w:color="FFFFFF" w:sz="0"/>
+              <w:left w:val="none" w:color="FFFFFF" w:sz="0"/>
+              <w:bottom w:val="single" w:color="D8D1C5" w:sz="4"/>
+              <w:right w:val="none" w:color="FFFFFF" w:sz="0"/>
+            </w:tcBorders>
+            <w:shd w:fill="F5F2EC" w:color="auto" w:val="clear"/>
+            <w:tcMar>
+              <w:top w:type="dxa" w:w="90"/>
+              <w:left w:type="dxa" w:w="120"/>
+              <w:bottom w:type="dxa" w:w="90"/>
+              <w:right w:type="dxa" w:w="120"/>
+            </w:tcMar>
+          </w:tcPr>
+          <w:p>
+            <w:r>
+              <w:rPr>
+                <w:rFonts w:ascii="Arial" w:cs="Arial" w:eastAsia="Arial" w:hAnsi="Arial"/>
+                <w:color w:val="1C1A17"/>
+                <w:sz w:val="19"/>
+                <w:szCs w:val="19"/>
+              </w:rPr>
+              <w:t xml:space="preserve">Who approves on your side (name, role)</w:t>
+            </w:r>
+          </w:p>
+        </w:tc>
+        <w:tc>
+          <w:tcPr>
+            <w:tcW w:type="dxa" w:w="6038"/>
+            <w:tcBorders>
+              <w:top w:val="none" w:color="FFFFFF" w:sz="0"/>
+              <w:left w:val="none" w:color="FFFFFF" w:sz="0"/>
+              <w:bottom w:val="single" w:color="D8D1C5" w:sz="4"/>
+              <w:right w:val="none" w:color="FFFFFF" w:sz="0"/>
+            </w:tcBorders>
+            <w:tcMar>
+              <w:top w:type="dxa" w:w="90"/>
+              <w:left w:type="dxa" w:w="160"/>
+              <w:bottom w:type="dxa" w:w="90"/>
+              <w:right w:type="dxa" w:w="120"/>
+            </w:tcMar>
+          </w:tcPr>
+          <w:p>
+            <w:r>
+              <w:rPr>
+                <w:rFonts w:ascii="Arial" w:cs="Arial" w:eastAsia="Arial" w:hAnsi="Arial"/>
+                <w:sz w:val="20"/>
+                <w:szCs w:val="20"/>
+              </w:rPr>
+              <w:t xml:space="preserve"/>
+            </w:r>
+          </w:p>
+        </w:tc>
+      </w:tr>
+      <w:tr>
+        <w:trPr>
+          <w:trHeight w:val="480" w:hRule="atLeast"/>
+        </w:trPr>
+        <w:tc>
+          <w:tcPr>
+            <w:tcW w:type="dxa" w:w="3600"/>
+            <w:tcBorders>
+              <w:top w:val="none" w:color="FFFFFF" w:sz="0"/>
+              <w:left w:val="none" w:color="FFFFFF" w:sz="0"/>
+              <w:bottom w:val="single" w:color="D8D1C5" w:sz="4"/>
+              <w:right w:val="none" w:color="FFFFFF" w:sz="0"/>
+            </w:tcBorders>
+            <w:shd w:fill="F5F2EC" w:color="auto" w:val="clear"/>
+            <w:tcMar>
+              <w:top w:type="dxa" w:w="90"/>
+              <w:left w:type="dxa" w:w="120"/>
+              <w:bottom w:type="dxa" w:w="90"/>
+              <w:right w:type="dxa" w:w="120"/>
+            </w:tcMar>
+          </w:tcPr>
+          <w:p>
+            <w:r>
+              <w:rPr>
+                <w:rFonts w:ascii="Arial" w:cs="Arial" w:eastAsia="Arial" w:hAnsi="Arial"/>
+                <w:color w:val="1C1A17"/>
+                <w:sz w:val="19"/>
+                <w:szCs w:val="19"/>
+              </w:rPr>
+              <w:t xml:space="preserve">Organiser deadlines (drawings, service orders)</w:t>
+            </w:r>
+          </w:p>
+        </w:tc>
+        <w:tc>
+          <w:tcPr>
+            <w:tcW w:type="dxa" w:w="6038"/>
+            <w:tcBorders>
+              <w:top w:val="none" w:color="FFFFFF" w:sz="0"/>
+              <w:left w:val="none" w:color="FFFFFF" w:sz="0"/>
+              <w:bottom w:val="single" w:color="D8D1C5" w:sz="4"/>
+              <w:right w:val="none" w:color="FFFFFF" w:sz="0"/>
+            </w:tcBorders>
+            <w:tcMar>
+              <w:top w:type="dxa" w:w="90"/>
+              <w:left w:type="dxa" w:w="160"/>
+              <w:bottom w:type="dxa" w:w="90"/>
+              <w:right w:type="dxa" w:w="120"/>
+            </w:tcMar>
+          </w:tcPr>
+          <w:p>
+            <w:r>
+              <w:rPr>
+                <w:rFonts w:ascii="Arial" w:cs="Arial" w:eastAsia="Arial" w:hAnsi="Arial"/>
+                <w:sz w:val="20"/>
+                <w:szCs w:val="20"/>
+              </w:rPr>
+              <w:t xml:space="preserve"/>
+            </w:r>
+          </w:p>
+        </w:tc>
+      </w:tr>
+    </w:tbl>
+    <w:p>
+      <w:pPr>
+        <w:keepNext/>
+        <w:spacing w:after="100" w:before="260"/>
+      </w:pPr>
+      <w:r>
+        <w:rPr>
+          <w:rFonts w:ascii="Arial" w:cs="Arial" w:eastAsia="Arial" w:hAnsi="Arial"/>
+          <w:b/>
+          <w:bCs/>
+          <w:color w:val="13704D"/>
+          <w:spacing w:val="20"/>
+          <w:sz w:val="18"/>
+          <w:szCs w:val="18"/>
+        </w:rPr>
+        <w:t xml:space="preserve">NOTES</w:t>
       </w:r>
     </w:p>
     <w:tbl>
@@ -1146,21 +1782,7 @@
                 <w:sz w:val="19"/>
                 <w:szCs w:val="19"/>
               </w:rPr>
-              <w:t xml:space="preserve">What the stand must hold</w:t>
-            </w:r>
-          </w:p>
-          <w:p>
-            <w:pPr>
-              <w:spacing w:before="80"/>
-            </w:pPr>
-            <w:r>
-              <w:rPr>
-                <w:rFonts w:ascii="Arial" w:cs="Arial" w:eastAsia="Arial" w:hAnsi="Arial"/>
-                <w:color w:val="5B5650"/>
-                <w:sz w:val="16"/>
-                <w:szCs w:val="16"/>
-              </w:rPr>
-              <w:t xml:space="preserve">For example: products to show (with sizes and weights), screens, counters, shelves, a meeting area (open or closed, how many seats), a storage room, a kitchen or a bar.</w:t>
+              <w:t xml:space="preserve">Anything else we should know</w:t>
             </w:r>
           </w:p>
         </w:tc>
@@ -1195,625 +1817,16 @@
     </w:tbl>
     <w:p>
       <w:pPr>
-        <w:keepNext/>
-        <w:spacing w:after="100" w:before="260"/>
-      </w:pPr>
-      <w:r>
-        <w:rPr>
-          <w:rFonts w:ascii="Arial" w:cs="Arial" w:eastAsia="Arial" w:hAnsi="Arial"/>
-          <w:b/>
-          <w:bCs/>
-          <w:color w:val="13704D"/>
-          <w:spacing w:val="20"/>
-          <w:sz w:val="18"/>
-          <w:szCs w:val="18"/>
-        </w:rPr>
-        <w:t xml:space="preserve">4  YOUR BRAND</w:t>
+        <w:spacing w:after="0" w:before="0" w:line="20" w:lineRule="exact"/>
+      </w:pPr>
+      <w:r>
+        <w:rPr>
+          <w:sz w:val="2"/>
+          <w:szCs w:val="2"/>
+        </w:rPr>
+        <w:t xml:space="preserve"/>
       </w:r>
     </w:p>
-    <w:p>
-      <w:pPr>
-        <w:spacing w:after="60"/>
-      </w:pPr>
-      <w:r>
-        <w:rPr>
-          <w:rFonts w:ascii="Arial" w:cs="Arial" w:eastAsia="Arial" w:hAnsi="Arial"/>
-          <w:color w:val="1C1A17"/>
-          <w:sz w:val="19"/>
-          <w:szCs w:val="19"/>
-        </w:rPr>
-        <w:t xml:space="preserve">Please attach to your email what you have:</w:t>
-      </w:r>
-    </w:p>
-    <w:p>
-      <w:pPr>
-        <w:spacing w:after="40"/>
-        <w:ind w:left="120"/>
-      </w:pPr>
-      <w:r>
-        <w:rPr>
-          <w:rFonts w:ascii="DejaVu Sans" w:cs="DejaVu Sans" w:eastAsia="DejaVu Sans" w:hAnsi="DejaVu Sans"/>
-          <w:color w:val="1C1A17"/>
-          <w:sz w:val="22"/>
-          <w:szCs w:val="22"/>
-        </w:rPr>
-        <w:t xml:space="preserve">☐</w:t>
-      </w:r>
-      <w:r>
-        <w:rPr>
-          <w:rFonts w:ascii="Arial" w:cs="Arial" w:eastAsia="Arial" w:hAnsi="Arial"/>
-          <w:color w:val="1C1A17"/>
-          <w:sz w:val="19"/>
-          <w:szCs w:val="19"/>
-        </w:rPr>
-        <w:t xml:space="preserve">   Logo as a vector file (AI, EPS, SVG or PDF)</w:t>
-      </w:r>
-    </w:p>
-    <w:p>
-      <w:pPr>
-        <w:spacing w:after="40"/>
-        <w:ind w:left="120"/>
-      </w:pPr>
-      <w:r>
-        <w:rPr>
-          <w:rFonts w:ascii="DejaVu Sans" w:cs="DejaVu Sans" w:eastAsia="DejaVu Sans" w:hAnsi="DejaVu Sans"/>
-          <w:color w:val="1C1A17"/>
-          <w:sz w:val="22"/>
-          <w:szCs w:val="22"/>
-        </w:rPr>
-        <w:t xml:space="preserve">☐</w:t>
-      </w:r>
-      <w:r>
-        <w:rPr>
-          <w:rFonts w:ascii="Arial" w:cs="Arial" w:eastAsia="Arial" w:hAnsi="Arial"/>
-          <w:color w:val="1C1A17"/>
-          <w:sz w:val="19"/>
-          <w:szCs w:val="19"/>
-        </w:rPr>
-        <w:t xml:space="preserve">   Brand guidelines (colours, fonts)</w:t>
-      </w:r>
-    </w:p>
-    <w:p>
-      <w:pPr>
-        <w:spacing w:after="40"/>
-        <w:ind w:left="120"/>
-      </w:pPr>
-      <w:r>
-        <w:rPr>
-          <w:rFonts w:ascii="DejaVu Sans" w:cs="DejaVu Sans" w:eastAsia="DejaVu Sans" w:hAnsi="DejaVu Sans"/>
-          <w:color w:val="1C1A17"/>
-          <w:sz w:val="22"/>
-          <w:szCs w:val="22"/>
-        </w:rPr>
-        <w:t xml:space="preserve">☐</w:t>
-      </w:r>
-      <w:r>
-        <w:rPr>
-          <w:rFonts w:ascii="Arial" w:cs="Arial" w:eastAsia="Arial" w:hAnsi="Arial"/>
-          <w:color w:val="1C1A17"/>
-          <w:sz w:val="19"/>
-          <w:szCs w:val="19"/>
-        </w:rPr>
-        <w:t xml:space="preserve">   Photos and key messages for the walls</w:t>
-      </w:r>
-    </w:p>
-    <w:p>
-      <w:pPr>
-        <w:spacing w:after="40"/>
-        <w:ind w:left="120"/>
-      </w:pPr>
-      <w:r>
-        <w:rPr>
-          <w:rFonts w:ascii="DejaVu Sans" w:cs="DejaVu Sans" w:eastAsia="DejaVu Sans" w:hAnsi="DejaVu Sans"/>
-          <w:color w:val="1C1A17"/>
-          <w:sz w:val="22"/>
-          <w:szCs w:val="22"/>
-        </w:rPr>
-        <w:t xml:space="preserve">☐</w:t>
-      </w:r>
-      <w:r>
-        <w:rPr>
-          <w:rFonts w:ascii="Arial" w:cs="Arial" w:eastAsia="Arial" w:hAnsi="Arial"/>
-          <w:color w:val="1C1A17"/>
-          <w:sz w:val="19"/>
-          <w:szCs w:val="19"/>
-        </w:rPr>
-        <w:t xml:space="preserve">   Photos of past stands, if you have them</w:t>
-      </w:r>
-    </w:p>
-    <w:p>
-      <w:pPr>
-        <w:spacing w:after="100"/>
-      </w:pPr>
-    </w:p>
-    <w:tbl>
-      <w:tblPr>
-        <w:tblW w:type="dxa" w:w="9638"/>
-        <w:tblBorders>
-          <w:top w:val="single" w:color="D8D1C5" w:sz="4"/>
-          <w:left w:val="none" w:color="FFFFFF" w:sz="0"/>
-          <w:bottom w:val="none" w:color="FFFFFF" w:sz="0"/>
-          <w:right w:val="none" w:color="FFFFFF" w:sz="0"/>
-          <w:insideH w:val="none" w:color="FFFFFF" w:sz="0"/>
-          <w:insideV w:val="none" w:color="FFFFFF" w:sz="0"/>
-        </w:tblBorders>
-      </w:tblPr>
-      <w:tblGrid>
-        <w:gridCol w:w="3600"/>
-        <w:gridCol w:w="6038"/>
-      </w:tblGrid>
-      <w:tr>
-        <w:trPr>
-          <w:trHeight w:val="520" w:hRule="atLeast"/>
-        </w:trPr>
-        <w:tc>
-          <w:tcPr>
-            <w:tcW w:type="dxa" w:w="3600"/>
-            <w:tcBorders>
-              <w:top w:val="none" w:color="FFFFFF" w:sz="0"/>
-              <w:left w:val="none" w:color="FFFFFF" w:sz="0"/>
-              <w:bottom w:val="single" w:color="D8D1C5" w:sz="4"/>
-              <w:right w:val="none" w:color="FFFFFF" w:sz="0"/>
-            </w:tcBorders>
-            <w:shd w:fill="F5F2EC" w:color="auto" w:val="clear"/>
-            <w:tcMar>
-              <w:top w:type="dxa" w:w="90"/>
-              <w:left w:type="dxa" w:w="120"/>
-              <w:bottom w:type="dxa" w:w="90"/>
-              <w:right w:type="dxa" w:w="120"/>
-            </w:tcMar>
-          </w:tcPr>
-          <w:p>
-            <w:r>
-              <w:rPr>
-                <w:rFonts w:ascii="Arial" w:cs="Arial" w:eastAsia="Arial" w:hAnsi="Arial"/>
-                <w:color w:val="1C1A17"/>
-                <w:sz w:val="19"/>
-                <w:szCs w:val="19"/>
-              </w:rPr>
-              <w:t xml:space="preserve">Past stands: what you liked, what you didn't</w:t>
-            </w:r>
-          </w:p>
-        </w:tc>
-        <w:tc>
-          <w:tcPr>
-            <w:tcW w:type="dxa" w:w="6038"/>
-            <w:tcBorders>
-              <w:top w:val="none" w:color="FFFFFF" w:sz="0"/>
-              <w:left w:val="none" w:color="FFFFFF" w:sz="0"/>
-              <w:bottom w:val="single" w:color="D8D1C5" w:sz="4"/>
-              <w:right w:val="none" w:color="FFFFFF" w:sz="0"/>
-            </w:tcBorders>
-            <w:tcMar>
-              <w:top w:type="dxa" w:w="90"/>
-              <w:left w:type="dxa" w:w="160"/>
-              <w:bottom w:type="dxa" w:w="90"/>
-              <w:right w:type="dxa" w:w="120"/>
-            </w:tcMar>
-          </w:tcPr>
-          <w:p>
-            <w:r>
-              <w:rPr>
-                <w:rFonts w:ascii="Arial" w:cs="Arial" w:eastAsia="Arial" w:hAnsi="Arial"/>
-                <w:sz w:val="20"/>
-                <w:szCs w:val="20"/>
-              </w:rPr>
-              <w:t xml:space="preserve"/>
-            </w:r>
-          </w:p>
-        </w:tc>
-      </w:tr>
-    </w:tbl>
-    <w:p>
-      <w:pPr>
-        <w:keepNext/>
-        <w:spacing w:after="100" w:before="260"/>
-      </w:pPr>
-      <w:r>
-        <w:rPr>
-          <w:rFonts w:ascii="Arial" w:cs="Arial" w:eastAsia="Arial" w:hAnsi="Arial"/>
-          <w:b/>
-          <w:bCs/>
-          <w:color w:val="13704D"/>
-          <w:spacing w:val="20"/>
-          <w:sz w:val="18"/>
-          <w:szCs w:val="18"/>
-        </w:rPr>
-        <w:t xml:space="preserve">5  BUDGET</w:t>
-      </w:r>
-    </w:p>
-    <w:tbl>
-      <w:tblPr>
-        <w:tblW w:type="dxa" w:w="9638"/>
-        <w:tblBorders>
-          <w:top w:val="single" w:color="D8D1C5" w:sz="4"/>
-          <w:left w:val="none" w:color="FFFFFF" w:sz="0"/>
-          <w:bottom w:val="none" w:color="FFFFFF" w:sz="0"/>
-          <w:right w:val="none" w:color="FFFFFF" w:sz="0"/>
-          <w:insideH w:val="none" w:color="FFFFFF" w:sz="0"/>
-          <w:insideV w:val="none" w:color="FFFFFF" w:sz="0"/>
-        </w:tblBorders>
-      </w:tblPr>
-      <w:tblGrid>
-        <w:gridCol w:w="3600"/>
-        <w:gridCol w:w="6038"/>
-      </w:tblGrid>
-      <w:tr>
-        <w:trPr>
-          <w:trHeight w:val="520" w:hRule="atLeast"/>
-        </w:trPr>
-        <w:tc>
-          <w:tcPr>
-            <w:tcW w:type="dxa" w:w="3600"/>
-            <w:tcBorders>
-              <w:top w:val="none" w:color="FFFFFF" w:sz="0"/>
-              <w:left w:val="none" w:color="FFFFFF" w:sz="0"/>
-              <w:bottom w:val="single" w:color="D8D1C5" w:sz="4"/>
-              <w:right w:val="none" w:color="FFFFFF" w:sz="0"/>
-            </w:tcBorders>
-            <w:shd w:fill="F5F2EC" w:color="auto" w:val="clear"/>
-            <w:tcMar>
-              <w:top w:type="dxa" w:w="90"/>
-              <w:left w:type="dxa" w:w="120"/>
-              <w:bottom w:type="dxa" w:w="90"/>
-              <w:right w:type="dxa" w:w="120"/>
-            </w:tcMar>
-          </w:tcPr>
-          <w:p>
-            <w:r>
-              <w:rPr>
-                <w:rFonts w:ascii="Arial" w:cs="Arial" w:eastAsia="Arial" w:hAnsi="Arial"/>
-                <w:color w:val="1C1A17"/>
-                <w:sz w:val="19"/>
-                <w:szCs w:val="19"/>
-              </w:rPr>
-              <w:t xml:space="preserve">Budget range for the whole project</w:t>
-            </w:r>
-          </w:p>
-        </w:tc>
-        <w:tc>
-          <w:tcPr>
-            <w:tcW w:type="dxa" w:w="6038"/>
-            <w:tcBorders>
-              <w:top w:val="none" w:color="FFFFFF" w:sz="0"/>
-              <w:left w:val="none" w:color="FFFFFF" w:sz="0"/>
-              <w:bottom w:val="single" w:color="D8D1C5" w:sz="4"/>
-              <w:right w:val="none" w:color="FFFFFF" w:sz="0"/>
-            </w:tcBorders>
-            <w:tcMar>
-              <w:top w:type="dxa" w:w="90"/>
-              <w:left w:type="dxa" w:w="160"/>
-              <w:bottom w:type="dxa" w:w="90"/>
-              <w:right w:type="dxa" w:w="120"/>
-            </w:tcMar>
-          </w:tcPr>
-          <w:p>
-            <w:r>
-              <w:rPr>
-                <w:rFonts w:ascii="Arial" w:cs="Arial" w:eastAsia="Arial" w:hAnsi="Arial"/>
-                <w:sz w:val="20"/>
-                <w:szCs w:val="20"/>
-              </w:rPr>
-              <w:t xml:space="preserve"/>
-            </w:r>
-          </w:p>
-        </w:tc>
-      </w:tr>
-    </w:tbl>
-    <w:p>
-      <w:pPr>
-        <w:keepNext/>
-        <w:spacing w:after="100" w:before="260"/>
-      </w:pPr>
-      <w:r>
-        <w:rPr>
-          <w:rFonts w:ascii="Arial" w:cs="Arial" w:eastAsia="Arial" w:hAnsi="Arial"/>
-          <w:b/>
-          <w:bCs/>
-          <w:color w:val="13704D"/>
-          <w:spacing w:val="20"/>
-          <w:sz w:val="18"/>
-          <w:szCs w:val="18"/>
-        </w:rPr>
-        <w:t xml:space="preserve">6  DATES AND DECISIONS</w:t>
-      </w:r>
-    </w:p>
-    <w:tbl>
-      <w:tblPr>
-        <w:tblW w:type="dxa" w:w="9638"/>
-        <w:tblBorders>
-          <w:top w:val="single" w:color="D8D1C5" w:sz="4"/>
-          <w:left w:val="none" w:color="FFFFFF" w:sz="0"/>
-          <w:bottom w:val="none" w:color="FFFFFF" w:sz="0"/>
-          <w:right w:val="none" w:color="FFFFFF" w:sz="0"/>
-          <w:insideH w:val="none" w:color="FFFFFF" w:sz="0"/>
-          <w:insideV w:val="none" w:color="FFFFFF" w:sz="0"/>
-        </w:tblBorders>
-      </w:tblPr>
-      <w:tblGrid>
-        <w:gridCol w:w="3600"/>
-        <w:gridCol w:w="6038"/>
-      </w:tblGrid>
-      <w:tr>
-        <w:trPr>
-          <w:trHeight w:val="520" w:hRule="atLeast"/>
-        </w:trPr>
-        <w:tc>
-          <w:tcPr>
-            <w:tcW w:type="dxa" w:w="3600"/>
-            <w:tcBorders>
-              <w:top w:val="none" w:color="FFFFFF" w:sz="0"/>
-              <w:left w:val="none" w:color="FFFFFF" w:sz="0"/>
-              <w:bottom w:val="single" w:color="D8D1C5" w:sz="4"/>
-              <w:right w:val="none" w:color="FFFFFF" w:sz="0"/>
-            </w:tcBorders>
-            <w:shd w:fill="F5F2EC" w:color="auto" w:val="clear"/>
-            <w:tcMar>
-              <w:top w:type="dxa" w:w="90"/>
-              <w:left w:type="dxa" w:w="120"/>
-              <w:bottom w:type="dxa" w:w="90"/>
-              <w:right w:type="dxa" w:w="120"/>
-            </w:tcMar>
-          </w:tcPr>
-          <w:p>
-            <w:r>
-              <w:rPr>
-                <w:rFonts w:ascii="Arial" w:cs="Arial" w:eastAsia="Arial" w:hAnsi="Arial"/>
-                <w:color w:val="1C1A17"/>
-                <w:sz w:val="19"/>
-                <w:szCs w:val="19"/>
-              </w:rPr>
-              <w:t xml:space="preserve">First design needed by</w:t>
-            </w:r>
-          </w:p>
-        </w:tc>
-        <w:tc>
-          <w:tcPr>
-            <w:tcW w:type="dxa" w:w="6038"/>
-            <w:tcBorders>
-              <w:top w:val="none" w:color="FFFFFF" w:sz="0"/>
-              <w:left w:val="none" w:color="FFFFFF" w:sz="0"/>
-              <w:bottom w:val="single" w:color="D8D1C5" w:sz="4"/>
-              <w:right w:val="none" w:color="FFFFFF" w:sz="0"/>
-            </w:tcBorders>
-            <w:tcMar>
-              <w:top w:type="dxa" w:w="90"/>
-              <w:left w:type="dxa" w:w="160"/>
-              <w:bottom w:type="dxa" w:w="90"/>
-              <w:right w:type="dxa" w:w="120"/>
-            </w:tcMar>
-          </w:tcPr>
-          <w:p>
-            <w:r>
-              <w:rPr>
-                <w:rFonts w:ascii="Arial" w:cs="Arial" w:eastAsia="Arial" w:hAnsi="Arial"/>
-                <w:sz w:val="20"/>
-                <w:szCs w:val="20"/>
-              </w:rPr>
-              <w:t xml:space="preserve"/>
-            </w:r>
-          </w:p>
-        </w:tc>
-      </w:tr>
-      <w:tr>
-        <w:trPr>
-          <w:trHeight w:val="520" w:hRule="atLeast"/>
-        </w:trPr>
-        <w:tc>
-          <w:tcPr>
-            <w:tcW w:type="dxa" w:w="3600"/>
-            <w:tcBorders>
-              <w:top w:val="none" w:color="FFFFFF" w:sz="0"/>
-              <w:left w:val="none" w:color="FFFFFF" w:sz="0"/>
-              <w:bottom w:val="single" w:color="D8D1C5" w:sz="4"/>
-              <w:right w:val="none" w:color="FFFFFF" w:sz="0"/>
-            </w:tcBorders>
-            <w:shd w:fill="F5F2EC" w:color="auto" w:val="clear"/>
-            <w:tcMar>
-              <w:top w:type="dxa" w:w="90"/>
-              <w:left w:type="dxa" w:w="120"/>
-              <w:bottom w:type="dxa" w:w="90"/>
-              <w:right w:type="dxa" w:w="120"/>
-            </w:tcMar>
-          </w:tcPr>
-          <w:p>
-            <w:r>
-              <w:rPr>
-                <w:rFonts w:ascii="Arial" w:cs="Arial" w:eastAsia="Arial" w:hAnsi="Arial"/>
-                <w:color w:val="1C1A17"/>
-                <w:sz w:val="19"/>
-                <w:szCs w:val="19"/>
-              </w:rPr>
-              <w:t xml:space="preserve">Who approves on your side (name, role)</w:t>
-            </w:r>
-          </w:p>
-        </w:tc>
-        <w:tc>
-          <w:tcPr>
-            <w:tcW w:type="dxa" w:w="6038"/>
-            <w:tcBorders>
-              <w:top w:val="none" w:color="FFFFFF" w:sz="0"/>
-              <w:left w:val="none" w:color="FFFFFF" w:sz="0"/>
-              <w:bottom w:val="single" w:color="D8D1C5" w:sz="4"/>
-              <w:right w:val="none" w:color="FFFFFF" w:sz="0"/>
-            </w:tcBorders>
-            <w:tcMar>
-              <w:top w:type="dxa" w:w="90"/>
-              <w:left w:type="dxa" w:w="160"/>
-              <w:bottom w:type="dxa" w:w="90"/>
-              <w:right w:type="dxa" w:w="120"/>
-            </w:tcMar>
-          </w:tcPr>
-          <w:p>
-            <w:r>
-              <w:rPr>
-                <w:rFonts w:ascii="Arial" w:cs="Arial" w:eastAsia="Arial" w:hAnsi="Arial"/>
-                <w:sz w:val="20"/>
-                <w:szCs w:val="20"/>
-              </w:rPr>
-              <w:t xml:space="preserve"/>
-            </w:r>
-          </w:p>
-        </w:tc>
-      </w:tr>
-      <w:tr>
-        <w:trPr>
-          <w:trHeight w:val="520" w:hRule="atLeast"/>
-        </w:trPr>
-        <w:tc>
-          <w:tcPr>
-            <w:tcW w:type="dxa" w:w="3600"/>
-            <w:tcBorders>
-              <w:top w:val="none" w:color="FFFFFF" w:sz="0"/>
-              <w:left w:val="none" w:color="FFFFFF" w:sz="0"/>
-              <w:bottom w:val="single" w:color="D8D1C5" w:sz="4"/>
-              <w:right w:val="none" w:color="FFFFFF" w:sz="0"/>
-            </w:tcBorders>
-            <w:shd w:fill="F5F2EC" w:color="auto" w:val="clear"/>
-            <w:tcMar>
-              <w:top w:type="dxa" w:w="90"/>
-              <w:left w:type="dxa" w:w="120"/>
-              <w:bottom w:type="dxa" w:w="90"/>
-              <w:right w:type="dxa" w:w="120"/>
-            </w:tcMar>
-          </w:tcPr>
-          <w:p>
-            <w:r>
-              <w:rPr>
-                <w:rFonts w:ascii="Arial" w:cs="Arial" w:eastAsia="Arial" w:hAnsi="Arial"/>
-                <w:color w:val="1C1A17"/>
-                <w:sz w:val="19"/>
-                <w:szCs w:val="19"/>
-              </w:rPr>
-              <w:t xml:space="preserve">Organiser deadlines (drawings, service orders)</w:t>
-            </w:r>
-          </w:p>
-        </w:tc>
-        <w:tc>
-          <w:tcPr>
-            <w:tcW w:type="dxa" w:w="6038"/>
-            <w:tcBorders>
-              <w:top w:val="none" w:color="FFFFFF" w:sz="0"/>
-              <w:left w:val="none" w:color="FFFFFF" w:sz="0"/>
-              <w:bottom w:val="single" w:color="D8D1C5" w:sz="4"/>
-              <w:right w:val="none" w:color="FFFFFF" w:sz="0"/>
-            </w:tcBorders>
-            <w:tcMar>
-              <w:top w:type="dxa" w:w="90"/>
-              <w:left w:type="dxa" w:w="160"/>
-              <w:bottom w:type="dxa" w:w="90"/>
-              <w:right w:type="dxa" w:w="120"/>
-            </w:tcMar>
-          </w:tcPr>
-          <w:p>
-            <w:r>
-              <w:rPr>
-                <w:rFonts w:ascii="Arial" w:cs="Arial" w:eastAsia="Arial" w:hAnsi="Arial"/>
-                <w:sz w:val="20"/>
-                <w:szCs w:val="20"/>
-              </w:rPr>
-              <w:t xml:space="preserve"/>
-            </w:r>
-          </w:p>
-        </w:tc>
-      </w:tr>
-    </w:tbl>
-    <w:p>
-      <w:pPr>
-        <w:keepNext/>
-        <w:spacing w:after="100" w:before="260"/>
-      </w:pPr>
-      <w:r>
-        <w:rPr>
-          <w:rFonts w:ascii="Arial" w:cs="Arial" w:eastAsia="Arial" w:hAnsi="Arial"/>
-          <w:b/>
-          <w:bCs/>
-          <w:color w:val="13704D"/>
-          <w:spacing w:val="20"/>
-          <w:sz w:val="18"/>
-          <w:szCs w:val="18"/>
-        </w:rPr>
-        <w:t xml:space="preserve">NOTES</w:t>
-      </w:r>
-    </w:p>
-    <w:tbl>
-      <w:tblPr>
-        <w:tblW w:type="dxa" w:w="9638"/>
-        <w:tblBorders>
-          <w:top w:val="single" w:color="D8D1C5" w:sz="4"/>
-          <w:left w:val="none" w:color="FFFFFF" w:sz="0"/>
-          <w:bottom w:val="none" w:color="FFFFFF" w:sz="0"/>
-          <w:right w:val="none" w:color="FFFFFF" w:sz="0"/>
-          <w:insideH w:val="none" w:color="FFFFFF" w:sz="0"/>
-          <w:insideV w:val="none" w:color="FFFFFF" w:sz="0"/>
-        </w:tblBorders>
-      </w:tblPr>
-      <w:tblGrid>
-        <w:gridCol w:w="3600"/>
-        <w:gridCol w:w="6038"/>
-      </w:tblGrid>
-      <w:tr>
-        <w:trPr>
-          <w:trHeight w:val="3600" w:hRule="atLeast"/>
-        </w:trPr>
-        <w:tc>
-          <w:tcPr>
-            <w:tcW w:type="dxa" w:w="3600"/>
-            <w:tcBorders>
-              <w:top w:val="none" w:color="FFFFFF" w:sz="0"/>
-              <w:left w:val="none" w:color="FFFFFF" w:sz="0"/>
-              <w:bottom w:val="single" w:color="D8D1C5" w:sz="4"/>
-              <w:right w:val="none" w:color="FFFFFF" w:sz="0"/>
-            </w:tcBorders>
-            <w:shd w:fill="F5F2EC" w:color="auto" w:val="clear"/>
-            <w:tcMar>
-              <w:top w:type="dxa" w:w="90"/>
-              <w:left w:type="dxa" w:w="120"/>
-              <w:bottom w:type="dxa" w:w="90"/>
-              <w:right w:type="dxa" w:w="120"/>
-            </w:tcMar>
-          </w:tcPr>
-          <w:p>
-            <w:r>
-              <w:rPr>
-                <w:rFonts w:ascii="Arial" w:cs="Arial" w:eastAsia="Arial" w:hAnsi="Arial"/>
-                <w:color w:val="1C1A17"/>
-                <w:sz w:val="19"/>
-                <w:szCs w:val="19"/>
-              </w:rPr>
-              <w:t xml:space="preserve">Anything else we should know</w:t>
-            </w:r>
-          </w:p>
-        </w:tc>
-        <w:tc>
-          <w:tcPr>
-            <w:tcW w:type="dxa" w:w="6038"/>
-            <w:tcBorders>
-              <w:top w:val="none" w:color="FFFFFF" w:sz="0"/>
-              <w:left w:val="none" w:color="FFFFFF" w:sz="0"/>
-              <w:bottom w:val="single" w:color="D8D1C5" w:sz="4"/>
-              <w:right w:val="none" w:color="FFFFFF" w:sz="0"/>
-            </w:tcBorders>
-            <w:tcMar>
-              <w:top w:type="dxa" w:w="90"/>
-              <w:left w:type="dxa" w:w="160"/>
-              <w:bottom w:type="dxa" w:w="90"/>
-              <w:right w:type="dxa" w:w="120"/>
-            </w:tcMar>
-          </w:tcPr>
-          <w:p>
-            <w:r>
-              <w:rPr>
-                <w:rFonts w:ascii="Arial" w:cs="Arial" w:eastAsia="Arial" w:hAnsi="Arial"/>
-                <w:sz w:val="20"/>
-                <w:szCs w:val="20"/>
-              </w:rPr>
-              <w:t xml:space="preserve"/>
-            </w:r>
-          </w:p>
-        </w:tc>
-      </w:tr>
-    </w:tbl>
     <w:sectPr>
       <w:footerReference w:type="default" r:id="rId7"/>
       <w:pgSz w:w="11906" w:h="16838" w:orient="portrait"/>

</xml_diff>